<commit_message>
nmv 22 04 2026
</commit_message>
<xml_diff>
--- a/TS-Padam/TS-6.1/TS 6.1 Malayalam Pada Paatam Corrections.docx
+++ b/TS-Padam/TS-6.1/TS 6.1 Malayalam Pada Paatam Corrections.docx
@@ -59,10 +59,9 @@
           <w:bCs/>
           <w:sz w:val="32"/>
           <w:szCs w:val="32"/>
-          <w:highlight w:val="red"/>
           <w:u w:val="single"/>
         </w:rPr>
-        <w:t>?????</w:t>
+        <w:t>30th April 2026</w:t>
       </w:r>
     </w:p>
     <w:p>
@@ -213,7 +212,18 @@
                 <w:sz w:val="28"/>
                 <w:szCs w:val="28"/>
               </w:rPr>
-              <w:t>TS 6.1.</w:t>
+              <w:t xml:space="preserve">TS </w:t>
+            </w:r>
+            <w:proofErr w:type="gramStart"/>
+            <w:r>
+              <w:rPr>
+                <w:rFonts w:cs="Arial"/>
+                <w:b/>
+                <w:bCs/>
+                <w:sz w:val="28"/>
+                <w:szCs w:val="28"/>
+              </w:rPr>
+              <w:t>6.1.</w:t>
             </w:r>
             <w:r>
               <w:rPr>
@@ -233,7 +243,18 @@
                 <w:sz w:val="28"/>
                 <w:szCs w:val="28"/>
               </w:rPr>
-              <w:t xml:space="preserve"> - </w:t>
+              <w:t xml:space="preserve"> -</w:t>
+            </w:r>
+            <w:proofErr w:type="gramEnd"/>
+            <w:r>
+              <w:rPr>
+                <w:rFonts w:cs="Arial"/>
+                <w:b/>
+                <w:bCs/>
+                <w:sz w:val="28"/>
+                <w:szCs w:val="28"/>
+              </w:rPr>
+              <w:t xml:space="preserve"> </w:t>
             </w:r>
             <w:r>
               <w:rPr>
@@ -578,38 +599,40 @@
                 <w:sz w:val="28"/>
                 <w:szCs w:val="28"/>
               </w:rPr>
-              <w:t>TS 6.1.</w:t>
-            </w:r>
-            <w:r>
-              <w:rPr>
-                <w:rFonts w:cs="Arial"/>
-                <w:b/>
-                <w:bCs/>
-                <w:sz w:val="28"/>
-                <w:szCs w:val="28"/>
-              </w:rPr>
-              <w:t>3</w:t>
-            </w:r>
-            <w:r>
-              <w:rPr>
-                <w:rFonts w:cs="Arial"/>
-                <w:b/>
-                <w:bCs/>
-                <w:sz w:val="28"/>
-                <w:szCs w:val="28"/>
-              </w:rPr>
-              <w:t>.</w:t>
-            </w:r>
-            <w:r>
-              <w:rPr>
-                <w:rFonts w:cs="Arial"/>
-                <w:b/>
-                <w:bCs/>
-                <w:sz w:val="28"/>
-                <w:szCs w:val="28"/>
-              </w:rPr>
-              <w:t>8</w:t>
-            </w:r>
+              <w:t xml:space="preserve">TS </w:t>
+            </w:r>
+            <w:proofErr w:type="gramStart"/>
+            <w:r>
+              <w:rPr>
+                <w:rFonts w:cs="Arial"/>
+                <w:b/>
+                <w:bCs/>
+                <w:sz w:val="28"/>
+                <w:szCs w:val="28"/>
+              </w:rPr>
+              <w:t>6.1.</w:t>
+            </w:r>
+            <w:r>
+              <w:rPr>
+                <w:rFonts w:cs="Arial"/>
+                <w:b/>
+                <w:bCs/>
+                <w:sz w:val="28"/>
+                <w:szCs w:val="28"/>
+              </w:rPr>
+              <w:t xml:space="preserve">3.8 </w:t>
+            </w:r>
+            <w:r>
+              <w:rPr>
+                <w:rFonts w:cs="Arial"/>
+                <w:b/>
+                <w:bCs/>
+                <w:sz w:val="28"/>
+                <w:szCs w:val="28"/>
+              </w:rPr>
+              <w:t xml:space="preserve"> -</w:t>
+            </w:r>
+            <w:proofErr w:type="gramEnd"/>
             <w:r>
               <w:rPr>
                 <w:rFonts w:cs="Arial"/>
@@ -619,16 +642,6 @@
                 <w:szCs w:val="28"/>
               </w:rPr>
               <w:t xml:space="preserve"> </w:t>
-            </w:r>
-            <w:r>
-              <w:rPr>
-                <w:rFonts w:cs="Arial"/>
-                <w:b/>
-                <w:bCs/>
-                <w:sz w:val="28"/>
-                <w:szCs w:val="28"/>
-              </w:rPr>
-              <w:t xml:space="preserve"> - </w:t>
             </w:r>
             <w:r>
               <w:rPr>
@@ -952,7 +965,18 @@
                 <w:sz w:val="28"/>
                 <w:szCs w:val="28"/>
               </w:rPr>
-              <w:t>TS 6.1.</w:t>
+              <w:t xml:space="preserve">TS </w:t>
+            </w:r>
+            <w:proofErr w:type="gramStart"/>
+            <w:r>
+              <w:rPr>
+                <w:rFonts w:cs="Arial"/>
+                <w:b/>
+                <w:bCs/>
+                <w:sz w:val="28"/>
+                <w:szCs w:val="28"/>
+              </w:rPr>
+              <w:t>6.1.</w:t>
             </w:r>
             <w:r>
               <w:rPr>
@@ -972,7 +996,18 @@
                 <w:sz w:val="28"/>
                 <w:szCs w:val="28"/>
               </w:rPr>
-              <w:t xml:space="preserve"> - </w:t>
+              <w:t xml:space="preserve"> -</w:t>
+            </w:r>
+            <w:proofErr w:type="gramEnd"/>
+            <w:r>
+              <w:rPr>
+                <w:rFonts w:cs="Arial"/>
+                <w:b/>
+                <w:bCs/>
+                <w:sz w:val="28"/>
+                <w:szCs w:val="28"/>
+              </w:rPr>
+              <w:t xml:space="preserve"> </w:t>
             </w:r>
             <w:r>
               <w:rPr>
@@ -1195,7 +1230,18 @@
                 <w:sz w:val="28"/>
                 <w:szCs w:val="28"/>
               </w:rPr>
-              <w:t>TS 6.1</w:t>
+              <w:t xml:space="preserve">TS </w:t>
+            </w:r>
+            <w:proofErr w:type="gramStart"/>
+            <w:r>
+              <w:rPr>
+                <w:rFonts w:cs="Arial"/>
+                <w:b/>
+                <w:bCs/>
+                <w:sz w:val="28"/>
+                <w:szCs w:val="28"/>
+              </w:rPr>
+              <w:t>6.1</w:t>
             </w:r>
             <w:r>
               <w:rPr>
@@ -1245,7 +1291,18 @@
                 <w:sz w:val="28"/>
                 <w:szCs w:val="28"/>
               </w:rPr>
-              <w:t xml:space="preserve"> - </w:t>
+              <w:t xml:space="preserve"> -</w:t>
+            </w:r>
+            <w:proofErr w:type="gramEnd"/>
+            <w:r>
+              <w:rPr>
+                <w:rFonts w:cs="Arial"/>
+                <w:b/>
+                <w:bCs/>
+                <w:sz w:val="28"/>
+                <w:szCs w:val="28"/>
+              </w:rPr>
+              <w:t xml:space="preserve"> </w:t>
             </w:r>
             <w:r>
               <w:rPr>
@@ -1477,7 +1534,18 @@
                 <w:sz w:val="28"/>
                 <w:szCs w:val="28"/>
               </w:rPr>
-              <w:t>TS 6.</w:t>
+              <w:t xml:space="preserve">TS </w:t>
+            </w:r>
+            <w:proofErr w:type="gramStart"/>
+            <w:r>
+              <w:rPr>
+                <w:rFonts w:cs="Arial"/>
+                <w:b/>
+                <w:bCs/>
+                <w:sz w:val="28"/>
+                <w:szCs w:val="28"/>
+              </w:rPr>
+              <w:t>6.</w:t>
             </w:r>
             <w:r>
               <w:rPr>
@@ -1497,7 +1565,18 @@
                 <w:sz w:val="28"/>
                 <w:szCs w:val="28"/>
               </w:rPr>
-              <w:t xml:space="preserve"> - </w:t>
+              <w:t xml:space="preserve"> -</w:t>
+            </w:r>
+            <w:proofErr w:type="gramEnd"/>
+            <w:r>
+              <w:rPr>
+                <w:rFonts w:cs="Arial"/>
+                <w:b/>
+                <w:bCs/>
+                <w:sz w:val="28"/>
+                <w:szCs w:val="28"/>
+              </w:rPr>
+              <w:t xml:space="preserve"> </w:t>
             </w:r>
             <w:r>
               <w:rPr>
@@ -1844,6 +1923,18 @@
           <w:u w:val="single"/>
         </w:rPr>
       </w:pPr>
+    </w:p>
+    <w:p>
+      <w:pPr>
+        <w:jc w:val="center"/>
+        <w:rPr>
+          <w:b/>
+          <w:bCs/>
+          <w:sz w:val="32"/>
+          <w:szCs w:val="32"/>
+          <w:u w:val="single"/>
+        </w:rPr>
+      </w:pPr>
       <w:r>
         <w:rPr>
           <w:b/>
@@ -1852,6 +1943,7 @@
           <w:szCs w:val="32"/>
           <w:u w:val="single"/>
         </w:rPr>
+        <w:lastRenderedPageBreak/>
         <w:t>TS Pada Paatam – TS 6.1 Malayalam co</w:t>
       </w:r>
       <w:r>
@@ -1929,7 +2021,6 @@
           <w:b/>
           <w:bCs/>
         </w:rPr>
-        <w:lastRenderedPageBreak/>
         <w:t>(ignore those which are already incorporated in your book’s version and date)</w:t>
       </w:r>
     </w:p>
@@ -2064,7 +2155,18 @@
                 <w:sz w:val="28"/>
                 <w:szCs w:val="28"/>
               </w:rPr>
-              <w:t>TS 6.1.</w:t>
+              <w:t xml:space="preserve">TS </w:t>
+            </w:r>
+            <w:proofErr w:type="gramStart"/>
+            <w:r>
+              <w:rPr>
+                <w:rFonts w:cs="Arial"/>
+                <w:b/>
+                <w:bCs/>
+                <w:sz w:val="28"/>
+                <w:szCs w:val="28"/>
+              </w:rPr>
+              <w:t>6.1.</w:t>
             </w:r>
             <w:r>
               <w:rPr>
@@ -2084,7 +2186,18 @@
                 <w:sz w:val="28"/>
                 <w:szCs w:val="28"/>
               </w:rPr>
-              <w:t xml:space="preserve"> - Padam</w:t>
+              <w:t xml:space="preserve"> -</w:t>
+            </w:r>
+            <w:proofErr w:type="gramEnd"/>
+            <w:r>
+              <w:rPr>
+                <w:rFonts w:cs="Arial"/>
+                <w:b/>
+                <w:bCs/>
+                <w:sz w:val="28"/>
+                <w:szCs w:val="28"/>
+              </w:rPr>
+              <w:t xml:space="preserve"> Padam</w:t>
             </w:r>
           </w:p>
           <w:p>
@@ -3025,7 +3138,18 @@
                 <w:sz w:val="28"/>
                 <w:szCs w:val="28"/>
               </w:rPr>
-              <w:t>TS 6.1.</w:t>
+              <w:t xml:space="preserve">TS </w:t>
+            </w:r>
+            <w:proofErr w:type="gramStart"/>
+            <w:r>
+              <w:rPr>
+                <w:rFonts w:cs="Arial"/>
+                <w:b/>
+                <w:bCs/>
+                <w:sz w:val="28"/>
+                <w:szCs w:val="28"/>
+              </w:rPr>
+              <w:t>6.1.</w:t>
             </w:r>
             <w:r>
               <w:rPr>
@@ -3045,7 +3169,18 @@
                 <w:sz w:val="28"/>
                 <w:szCs w:val="28"/>
               </w:rPr>
-              <w:t xml:space="preserve"> - Vaakyam</w:t>
+              <w:t xml:space="preserve"> -</w:t>
+            </w:r>
+            <w:proofErr w:type="gramEnd"/>
+            <w:r>
+              <w:rPr>
+                <w:rFonts w:cs="Arial"/>
+                <w:b/>
+                <w:bCs/>
+                <w:sz w:val="28"/>
+                <w:szCs w:val="28"/>
+              </w:rPr>
+              <w:t xml:space="preserve"> Vaakyam</w:t>
             </w:r>
           </w:p>
           <w:p>
@@ -3289,7 +3424,29 @@
                 <w:sz w:val="28"/>
                 <w:szCs w:val="28"/>
               </w:rPr>
-              <w:t>TS 6.1.5.3  - Vaakyam</w:t>
+              <w:t xml:space="preserve">TS </w:t>
+            </w:r>
+            <w:proofErr w:type="gramStart"/>
+            <w:r>
+              <w:rPr>
+                <w:rFonts w:cs="Arial"/>
+                <w:b/>
+                <w:bCs/>
+                <w:sz w:val="28"/>
+                <w:szCs w:val="28"/>
+              </w:rPr>
+              <w:t>6.1.5.3  -</w:t>
+            </w:r>
+            <w:proofErr w:type="gramEnd"/>
+            <w:r>
+              <w:rPr>
+                <w:rFonts w:cs="Arial"/>
+                <w:b/>
+                <w:bCs/>
+                <w:sz w:val="28"/>
+                <w:szCs w:val="28"/>
+              </w:rPr>
+              <w:t xml:space="preserve"> Vaakyam</w:t>
             </w:r>
           </w:p>
           <w:p>
@@ -5450,6 +5607,7 @@
               </w:rPr>
               <w:t>–</w:t>
             </w:r>
+            <w:proofErr w:type="gramStart"/>
             <w:r>
               <w:rPr>
                 <w:rFonts w:ascii="BRH Malayalam Extra" w:hAnsi="BRH Malayalam Extra" w:cs="BRH Malayalam Extra"/>
@@ -5458,6 +5616,7 @@
               </w:rPr>
               <w:t>PyZõx(</w:t>
             </w:r>
+            <w:proofErr w:type="gramEnd"/>
             <w:r>
               <w:rPr>
                 <w:rFonts w:cs="Arial"/>
@@ -5512,8 +5671,18 @@
                 <w:sz w:val="40"/>
                 <w:szCs w:val="40"/>
               </w:rPr>
-              <w:t>py - PyZõx(</w:t>
-            </w:r>
+              <w:t xml:space="preserve">py - </w:t>
+            </w:r>
+            <w:proofErr w:type="gramStart"/>
+            <w:r>
+              <w:rPr>
+                <w:rFonts w:ascii="BRH Malayalam Extra" w:hAnsi="BRH Malayalam Extra" w:cs="BRH Malayalam Extra"/>
+                <w:sz w:val="40"/>
+                <w:szCs w:val="40"/>
+              </w:rPr>
+              <w:t>PyZõx(</w:t>
+            </w:r>
+            <w:proofErr w:type="gramEnd"/>
             <w:r>
               <w:rPr>
                 <w:rFonts w:cs="Arial"/>
@@ -5572,6 +5741,7 @@
               </w:rPr>
               <w:t>–</w:t>
             </w:r>
+            <w:proofErr w:type="gramStart"/>
             <w:r>
               <w:rPr>
                 <w:rFonts w:ascii="BRH Malayalam Extra" w:hAnsi="BRH Malayalam Extra" w:cs="BRH Malayalam Extra"/>
@@ -5580,6 +5750,7 @@
               </w:rPr>
               <w:t>PyZõx(</w:t>
             </w:r>
+            <w:proofErr w:type="gramEnd"/>
             <w:r>
               <w:rPr>
                 <w:rFonts w:cs="Arial"/>
@@ -5634,8 +5805,18 @@
                 <w:sz w:val="40"/>
                 <w:szCs w:val="40"/>
               </w:rPr>
-              <w:t>py - PyZõx(</w:t>
-            </w:r>
+              <w:t xml:space="preserve">py - </w:t>
+            </w:r>
+            <w:proofErr w:type="gramStart"/>
+            <w:r>
+              <w:rPr>
+                <w:rFonts w:ascii="BRH Malayalam Extra" w:hAnsi="BRH Malayalam Extra" w:cs="BRH Malayalam Extra"/>
+                <w:sz w:val="40"/>
+                <w:szCs w:val="40"/>
+              </w:rPr>
+              <w:t>PyZõx(</w:t>
+            </w:r>
+            <w:proofErr w:type="gramEnd"/>
             <w:r>
               <w:rPr>
                 <w:rFonts w:cs="Arial"/>
@@ -5693,7 +5874,29 @@
                 <w:sz w:val="28"/>
                 <w:szCs w:val="28"/>
               </w:rPr>
-              <w:t>TS 6.1.9.6  - Vaakyam</w:t>
+              <w:t xml:space="preserve">TS </w:t>
+            </w:r>
+            <w:proofErr w:type="gramStart"/>
+            <w:r>
+              <w:rPr>
+                <w:rFonts w:cs="Arial"/>
+                <w:b/>
+                <w:bCs/>
+                <w:sz w:val="28"/>
+                <w:szCs w:val="28"/>
+              </w:rPr>
+              <w:t>6.1.9.6  -</w:t>
+            </w:r>
+            <w:proofErr w:type="gramEnd"/>
+            <w:r>
+              <w:rPr>
+                <w:rFonts w:cs="Arial"/>
+                <w:b/>
+                <w:bCs/>
+                <w:sz w:val="28"/>
+                <w:szCs w:val="28"/>
+              </w:rPr>
+              <w:t xml:space="preserve"> Vaakyam</w:t>
             </w:r>
           </w:p>
           <w:p>
@@ -5935,7 +6138,29 @@
                 <w:szCs w:val="28"/>
               </w:rPr>
               <w:lastRenderedPageBreak/>
-              <w:t>TS 6.1.10.3  - Vaakyam</w:t>
+              <w:t xml:space="preserve">TS </w:t>
+            </w:r>
+            <w:proofErr w:type="gramStart"/>
+            <w:r>
+              <w:rPr>
+                <w:rFonts w:cs="Arial"/>
+                <w:b/>
+                <w:bCs/>
+                <w:sz w:val="28"/>
+                <w:szCs w:val="28"/>
+              </w:rPr>
+              <w:t>6.1.10.3  -</w:t>
+            </w:r>
+            <w:proofErr w:type="gramEnd"/>
+            <w:r>
+              <w:rPr>
+                <w:rFonts w:cs="Arial"/>
+                <w:b/>
+                <w:bCs/>
+                <w:sz w:val="28"/>
+                <w:szCs w:val="28"/>
+              </w:rPr>
+              <w:t xml:space="preserve"> Vaakyam</w:t>
             </w:r>
           </w:p>
           <w:p>
@@ -6831,7 +7056,18 @@
                 <w:sz w:val="28"/>
                 <w:szCs w:val="28"/>
               </w:rPr>
-              <w:t>TS 6.1.11.</w:t>
+              <w:t xml:space="preserve">TS </w:t>
+            </w:r>
+            <w:proofErr w:type="gramStart"/>
+            <w:r>
+              <w:rPr>
+                <w:rFonts w:cs="Arial"/>
+                <w:b/>
+                <w:bCs/>
+                <w:sz w:val="28"/>
+                <w:szCs w:val="28"/>
+              </w:rPr>
+              <w:t>6.1.11.</w:t>
             </w:r>
             <w:r>
               <w:rPr>
@@ -6851,7 +7087,18 @@
                 <w:sz w:val="28"/>
                 <w:szCs w:val="28"/>
               </w:rPr>
-              <w:t xml:space="preserve">  - Vaakyam</w:t>
+              <w:t xml:space="preserve">  -</w:t>
+            </w:r>
+            <w:proofErr w:type="gramEnd"/>
+            <w:r>
+              <w:rPr>
+                <w:rFonts w:cs="Arial"/>
+                <w:b/>
+                <w:bCs/>
+                <w:sz w:val="28"/>
+                <w:szCs w:val="28"/>
+              </w:rPr>
+              <w:t xml:space="preserve"> Vaakyam</w:t>
             </w:r>
           </w:p>
           <w:p>
@@ -7106,7 +7353,29 @@
                 <w:sz w:val="28"/>
                 <w:szCs w:val="28"/>
               </w:rPr>
-              <w:t>TS 6.1.11.2  - Vaakyam</w:t>
+              <w:t xml:space="preserve">TS </w:t>
+            </w:r>
+            <w:proofErr w:type="gramStart"/>
+            <w:r>
+              <w:rPr>
+                <w:rFonts w:cs="Arial"/>
+                <w:b/>
+                <w:bCs/>
+                <w:sz w:val="28"/>
+                <w:szCs w:val="28"/>
+              </w:rPr>
+              <w:t>6.1.11.2  -</w:t>
+            </w:r>
+            <w:proofErr w:type="gramEnd"/>
+            <w:r>
+              <w:rPr>
+                <w:rFonts w:cs="Arial"/>
+                <w:b/>
+                <w:bCs/>
+                <w:sz w:val="28"/>
+                <w:szCs w:val="28"/>
+              </w:rPr>
+              <w:t xml:space="preserve"> Vaakyam</w:t>
             </w:r>
           </w:p>
           <w:p>
@@ -8945,6 +9214,7 @@
               </w:rPr>
               <w:t>h£</w:t>
             </w:r>
+            <w:proofErr w:type="gramStart"/>
             <w:r>
               <w:rPr>
                 <w:rFonts w:ascii="BRH Malayalam Extra" w:eastAsia="Times New Roman" w:hAnsi="BRH Malayalam Extra" w:cs="BRH Malayalam Extra"/>
@@ -8979,6 +9249,7 @@
               </w:rPr>
               <w:t>(</w:t>
             </w:r>
+            <w:proofErr w:type="gramEnd"/>
             <w:r>
               <w:rPr>
                 <w:rFonts w:cs="Arial"/>
@@ -9353,7 +9624,25 @@
                 <w:sz w:val="32"/>
                 <w:szCs w:val="32"/>
               </w:rPr>
-              <w:t xml:space="preserve">(it </w:t>
+              <w:t>(</w:t>
+            </w:r>
+            <w:proofErr w:type="gramStart"/>
+            <w:r>
+              <w:rPr>
+                <w:rFonts w:cs="Arial"/>
+                <w:sz w:val="32"/>
+                <w:szCs w:val="32"/>
+              </w:rPr>
+              <w:t>it</w:t>
+            </w:r>
+            <w:proofErr w:type="gramEnd"/>
+            <w:r>
+              <w:rPr>
+                <w:rFonts w:cs="Arial"/>
+                <w:sz w:val="32"/>
+                <w:szCs w:val="32"/>
+              </w:rPr>
+              <w:t xml:space="preserve"> </w:t>
             </w:r>
             <w:r>
               <w:rPr>
@@ -9605,6 +9894,7 @@
               </w:rPr>
               <w:t>ª</w:t>
             </w:r>
+            <w:proofErr w:type="gramStart"/>
             <w:r>
               <w:rPr>
                 <w:rFonts w:ascii="BRH Malayalam Extra" w:eastAsia="Times New Roman" w:hAnsi="BRH Malayalam Extra" w:cs="Kartika"/>
@@ -9623,6 +9913,7 @@
               </w:rPr>
               <w:t>.rx</w:t>
             </w:r>
+            <w:proofErr w:type="gramEnd"/>
             <w:r>
               <w:rPr>
                 <w:rFonts w:ascii="BRH Malayalam Extra" w:eastAsia="Times New Roman" w:hAnsi="BRH Malayalam Extra" w:cs="Kartika"/>
@@ -9852,6 +10143,7 @@
               </w:rPr>
               <w:t>ª</w:t>
             </w:r>
+            <w:proofErr w:type="gramStart"/>
             <w:r>
               <w:rPr>
                 <w:rFonts w:ascii="BRH Malayalam Extra" w:eastAsia="Times New Roman" w:hAnsi="BRH Malayalam Extra" w:cs="Kartika"/>
@@ -9870,6 +10162,7 @@
               </w:rPr>
               <w:t>.rx</w:t>
             </w:r>
+            <w:proofErr w:type="gramEnd"/>
             <w:r>
               <w:rPr>
                 <w:rFonts w:ascii="BRH Malayalam Extra" w:eastAsia="Times New Roman" w:hAnsi="BRH Malayalam Extra" w:cs="Kartika"/>
@@ -10517,6 +10810,8 @@
       <w:headerReference w:type="default" r:id="rId8"/>
       <w:footerReference w:type="even" r:id="rId9"/>
       <w:footerReference w:type="default" r:id="rId10"/>
+      <w:headerReference w:type="first" r:id="rId11"/>
+      <w:footerReference w:type="first" r:id="rId12"/>
       <w:pgSz w:w="15840" w:h="12240" w:orient="landscape"/>
       <w:pgMar w:top="1440" w:right="1440" w:bottom="1440" w:left="1440" w:header="720" w:footer="720" w:gutter="0"/>
       <w:cols w:space="720"/>
@@ -10552,6 +10847,7 @@
       <w:pBdr>
         <w:top w:val="single" w:sz="4" w:space="1" w:color="auto"/>
       </w:pBdr>
+      <w:jc w:val="right"/>
       <w:rPr>
         <w:b/>
         <w:bCs/>
@@ -10733,6 +11029,7 @@
       <w:pBdr>
         <w:top w:val="single" w:sz="4" w:space="1" w:color="auto"/>
       </w:pBdr>
+      <w:jc w:val="right"/>
       <w:rPr>
         <w:b/>
         <w:bCs/>
@@ -10921,6 +11218,16 @@
 </w:ftr>
 </file>
 
+<file path=word/footer3.xml><?xml version="1.0" encoding="utf-8"?>
+<w:ftr xmlns:wpc="http://schemas.microsoft.com/office/word/2010/wordprocessingCanvas" xmlns:cx="http://schemas.microsoft.com/office/drawing/2014/chartex" xmlns:cx1="http://schemas.microsoft.com/office/drawing/2015/9/8/chartex" xmlns:cx2="http://schemas.microsoft.com/office/drawing/2015/10/21/chartex" xmlns:cx3="http://schemas.microsoft.com/office/drawing/2016/5/9/chartex" xmlns:cx4="http://schemas.microsoft.com/office/drawing/2016/5/10/chartex" xmlns:cx5="http://schemas.microsoft.com/office/drawing/2016/5/11/chartex" xmlns:cx6="http://schemas.microsoft.com/office/drawing/2016/5/12/chartex" xmlns:cx7="http://schemas.microsoft.com/office/drawing/2016/5/13/chartex" xmlns:cx8="http://schemas.microsoft.com/office/drawing/2016/5/14/chartex" xmlns:mc="http://schemas.openxmlformats.org/markup-compatibility/2006" xmlns:aink="http://schemas.microsoft.com/office/drawing/2016/ink" xmlns:am3d="http://schemas.microsoft.com/office/drawing/2017/model3d" xmlns:o="urn:schemas-microsoft-com:office:office" xmlns:oel="http://schemas.microsoft.com/office/2019/extlst" xmlns:r="http://schemas.openxmlformats.org/officeDocument/2006/relationships" xmlns:m="http://schemas.openxmlformats.org/officeDocument/2006/math" xmlns:v="urn:schemas-microsoft-com:vml" xmlns:wp14="http://schemas.microsoft.com/office/word/2010/wordprocessingDrawing" xmlns:wp="http://schemas.openxmlformats.org/drawingml/2006/wordprocessingDrawing" xmlns:w10="urn:schemas-microsoft-com:office:word" xmlns:w="http://schemas.openxmlformats.org/wordprocessingml/2006/main" xmlns:w14="http://schemas.microsoft.com/office/word/2010/wordml" xmlns:w15="http://schemas.microsoft.com/office/word/2012/wordml" xmlns:w16cex="http://schemas.microsoft.com/office/word/2018/wordml/cex" xmlns:w16cid="http://schemas.microsoft.com/office/word/2016/wordml/cid" xmlns:w16="http://schemas.microsoft.com/office/word/2018/wordml" xmlns:w16du="http://schemas.microsoft.com/office/word/2023/wordml/word16du" xmlns:w16sdtdh="http://schemas.microsoft.com/office/word/2020/wordml/sdtdatahash" xmlns:w16sdtfl="http://schemas.microsoft.com/office/word/2024/wordml/sdtformatlock" xmlns:w16se="http://schemas.microsoft.com/office/word/2015/wordml/symex" xmlns:wpg="http://schemas.microsoft.com/office/word/2010/wordprocessingGroup" xmlns:wpi="http://schemas.microsoft.com/office/word/2010/wordprocessingInk" xmlns:wne="http://schemas.microsoft.com/office/word/2006/wordml" xmlns:wps="http://schemas.microsoft.com/office/word/2010/wordprocessingShape" mc:Ignorable="w14 w15 w16se w16cid w16 w16cex w16sdtdh w16sdtfl w16du wp14">
+  <w:p>
+    <w:pPr>
+      <w:pStyle w:val="Footer"/>
+    </w:pPr>
+  </w:p>
+</w:ftr>
+</file>
+
 <file path=word/footnotes.xml><?xml version="1.0" encoding="utf-8"?>
 <w:footnotes xmlns:wpc="http://schemas.microsoft.com/office/word/2010/wordprocessingCanvas" xmlns:cx="http://schemas.microsoft.com/office/drawing/2014/chartex" xmlns:cx1="http://schemas.microsoft.com/office/drawing/2015/9/8/chartex" xmlns:cx2="http://schemas.microsoft.com/office/drawing/2015/10/21/chartex" xmlns:cx3="http://schemas.microsoft.com/office/drawing/2016/5/9/chartex" xmlns:cx4="http://schemas.microsoft.com/office/drawing/2016/5/10/chartex" xmlns:cx5="http://schemas.microsoft.com/office/drawing/2016/5/11/chartex" xmlns:cx6="http://schemas.microsoft.com/office/drawing/2016/5/12/chartex" xmlns:cx7="http://schemas.microsoft.com/office/drawing/2016/5/13/chartex" xmlns:cx8="http://schemas.microsoft.com/office/drawing/2016/5/14/chartex" xmlns:mc="http://schemas.openxmlformats.org/markup-compatibility/2006" xmlns:aink="http://schemas.microsoft.com/office/drawing/2016/ink" xmlns:am3d="http://schemas.microsoft.com/office/drawing/2017/model3d" xmlns:o="urn:schemas-microsoft-com:office:office" xmlns:oel="http://schemas.microsoft.com/office/2019/extlst" xmlns:r="http://schemas.openxmlformats.org/officeDocument/2006/relationships" xmlns:m="http://schemas.openxmlformats.org/officeDocument/2006/math" xmlns:v="urn:schemas-microsoft-com:vml" xmlns:wp14="http://schemas.microsoft.com/office/word/2010/wordprocessingDrawing" xmlns:wp="http://schemas.openxmlformats.org/drawingml/2006/wordprocessingDrawing" xmlns:w10="urn:schemas-microsoft-com:office:word" xmlns:w="http://schemas.openxmlformats.org/wordprocessingml/2006/main" xmlns:w14="http://schemas.microsoft.com/office/word/2010/wordml" xmlns:w15="http://schemas.microsoft.com/office/word/2012/wordml" xmlns:w16cex="http://schemas.microsoft.com/office/word/2018/wordml/cex" xmlns:w16cid="http://schemas.microsoft.com/office/word/2016/wordml/cid" xmlns:w16="http://schemas.microsoft.com/office/word/2018/wordml" xmlns:w16du="http://schemas.microsoft.com/office/word/2023/wordml/word16du" xmlns:w16sdtdh="http://schemas.microsoft.com/office/word/2020/wordml/sdtdatahash" xmlns:w16sdtfl="http://schemas.microsoft.com/office/word/2024/wordml/sdtformatlock" xmlns:w16se="http://schemas.microsoft.com/office/word/2015/wordml/symex" xmlns:wpg="http://schemas.microsoft.com/office/word/2010/wordprocessingGroup" xmlns:wpi="http://schemas.microsoft.com/office/word/2010/wordprocessingInk" xmlns:wne="http://schemas.microsoft.com/office/word/2006/wordml" xmlns:wps="http://schemas.microsoft.com/office/word/2010/wordprocessingShape" mc:Ignorable="w14 w15 w16se w16cid w16 w16cex w16sdtdh w16sdtfl w16du wp14">
   <w:footnote w:type="separator" w:id="-1">
@@ -10961,6 +11268,16 @@
       <w:pBdr>
         <w:bottom w:val="single" w:sz="4" w:space="1" w:color="auto"/>
       </w:pBdr>
+    </w:pPr>
+  </w:p>
+</w:hdr>
+</file>
+
+<file path=word/header3.xml><?xml version="1.0" encoding="utf-8"?>
+<w:hdr xmlns:wpc="http://schemas.microsoft.com/office/word/2010/wordprocessingCanvas" xmlns:cx="http://schemas.microsoft.com/office/drawing/2014/chartex" xmlns:cx1="http://schemas.microsoft.com/office/drawing/2015/9/8/chartex" xmlns:cx2="http://schemas.microsoft.com/office/drawing/2015/10/21/chartex" xmlns:cx3="http://schemas.microsoft.com/office/drawing/2016/5/9/chartex" xmlns:cx4="http://schemas.microsoft.com/office/drawing/2016/5/10/chartex" xmlns:cx5="http://schemas.microsoft.com/office/drawing/2016/5/11/chartex" xmlns:cx6="http://schemas.microsoft.com/office/drawing/2016/5/12/chartex" xmlns:cx7="http://schemas.microsoft.com/office/drawing/2016/5/13/chartex" xmlns:cx8="http://schemas.microsoft.com/office/drawing/2016/5/14/chartex" xmlns:mc="http://schemas.openxmlformats.org/markup-compatibility/2006" xmlns:aink="http://schemas.microsoft.com/office/drawing/2016/ink" xmlns:am3d="http://schemas.microsoft.com/office/drawing/2017/model3d" xmlns:o="urn:schemas-microsoft-com:office:office" xmlns:oel="http://schemas.microsoft.com/office/2019/extlst" xmlns:r="http://schemas.openxmlformats.org/officeDocument/2006/relationships" xmlns:m="http://schemas.openxmlformats.org/officeDocument/2006/math" xmlns:v="urn:schemas-microsoft-com:vml" xmlns:wp14="http://schemas.microsoft.com/office/word/2010/wordprocessingDrawing" xmlns:wp="http://schemas.openxmlformats.org/drawingml/2006/wordprocessingDrawing" xmlns:w10="urn:schemas-microsoft-com:office:word" xmlns:w="http://schemas.openxmlformats.org/wordprocessingml/2006/main" xmlns:w14="http://schemas.microsoft.com/office/word/2010/wordml" xmlns:w15="http://schemas.microsoft.com/office/word/2012/wordml" xmlns:w16cex="http://schemas.microsoft.com/office/word/2018/wordml/cex" xmlns:w16cid="http://schemas.microsoft.com/office/word/2016/wordml/cid" xmlns:w16="http://schemas.microsoft.com/office/word/2018/wordml" xmlns:w16du="http://schemas.microsoft.com/office/word/2023/wordml/word16du" xmlns:w16sdtdh="http://schemas.microsoft.com/office/word/2020/wordml/sdtdatahash" xmlns:w16sdtfl="http://schemas.microsoft.com/office/word/2024/wordml/sdtformatlock" xmlns:w16se="http://schemas.microsoft.com/office/word/2015/wordml/symex" xmlns:wpg="http://schemas.microsoft.com/office/word/2010/wordprocessingGroup" xmlns:wpi="http://schemas.microsoft.com/office/word/2010/wordprocessingInk" xmlns:wne="http://schemas.microsoft.com/office/word/2006/wordml" xmlns:wps="http://schemas.microsoft.com/office/word/2010/wordprocessingShape" mc:Ignorable="w14 w15 w16se w16cid w16 w16cex w16sdtdh w16sdtfl w16du wp14">
+  <w:p>
+    <w:pPr>
+      <w:pStyle w:val="Header"/>
     </w:pPr>
   </w:p>
 </w:hdr>

</xml_diff>